<commit_message>
make 200qa and 89%
</commit_message>
<xml_diff>
--- a/notebooks/intent_rank/test_intent.docx
+++ b/notebooks/intent_rank/test_intent.docx
@@ -5,7 +5,6 @@
     <w:p>
       <w:pPr>
         <w:rPr>
-          <w:rFonts w:hint="cs"/>
           <w:cs/>
         </w:rPr>
       </w:pPr>
@@ -13,19 +12,17 @@
         <w:t>Gemini method</w:t>
       </w:r>
       <w:r>
-        <w:t xml:space="preserve"> No </w:t>
+        <w:t xml:space="preserve"> No bert</w:t>
       </w:r>
-      <w:proofErr w:type="spellStart"/>
-      <w:r>
-        <w:t>bert</w:t>
-      </w:r>
-      <w:proofErr w:type="spellEnd"/>
     </w:p>
     <w:p>
       <w:pPr>
         <w:jc w:val="center"/>
       </w:pPr>
       <w:r>
+        <w:rPr>
+          <w:noProof/>
+        </w:rPr>
         <w:drawing>
           <wp:inline distT="0" distB="0" distL="0" distR="0" wp14:anchorId="7BAD7002" wp14:editId="42330220">
             <wp:extent cx="4008730" cy="2047446"/>
@@ -78,6 +75,7 @@
       <w:r>
         <w:rPr>
           <w:rFonts w:cs="Cordia New"/>
+          <w:noProof/>
           <w:cs/>
         </w:rPr>
         <w:drawing>
@@ -120,7 +118,6 @@
     <w:p>
       <w:pPr>
         <w:rPr>
-          <w:rFonts w:hint="cs"/>
           <w:cs/>
         </w:rPr>
       </w:pPr>
@@ -145,21 +142,8 @@
         <w:t>edit-distance</w:t>
       </w:r>
       <w:r>
-        <w:t xml:space="preserve"> + </w:t>
+        <w:t xml:space="preserve"> + stopword + nwmm</w:t>
       </w:r>
-      <w:proofErr w:type="spellStart"/>
-      <w:r>
-        <w:t>stopword</w:t>
-      </w:r>
-      <w:proofErr w:type="spellEnd"/>
-      <w:r>
-        <w:t xml:space="preserve"> + </w:t>
-      </w:r>
-      <w:proofErr w:type="spellStart"/>
-      <w:r>
-        <w:t>nwmm</w:t>
-      </w:r>
-      <w:proofErr w:type="spellEnd"/>
     </w:p>
     <w:tbl>
       <w:tblPr>
@@ -187,13 +171,13 @@
             <w:pPr>
               <w:jc w:val="center"/>
               <w:rPr>
-                <w:rFonts w:hint="cs"/>
                 <w:cs/>
               </w:rPr>
             </w:pPr>
             <w:r>
               <w:rPr>
                 <w:rFonts w:cs="Cordia New"/>
+                <w:noProof/>
                 <w:cs/>
               </w:rPr>
               <w:drawing>
@@ -243,13 +227,11 @@
           <w:p>
             <w:pPr>
               <w:jc w:val="center"/>
-              <w:rPr>
-                <w:rFonts w:hint="cs"/>
-              </w:rPr>
             </w:pPr>
             <w:r>
               <w:rPr>
                 <w:rFonts w:cs="Cordia New"/>
+                <w:noProof/>
                 <w:cs/>
               </w:rPr>
               <w:drawing>
@@ -300,13 +282,13 @@
             <w:pPr>
               <w:jc w:val="center"/>
               <w:rPr>
-                <w:rFonts w:hint="cs"/>
                 <w:cs/>
               </w:rPr>
             </w:pPr>
             <w:r>
               <w:rPr>
                 <w:rFonts w:cs="Cordia New"/>
+                <w:noProof/>
                 <w:cs/>
               </w:rPr>
               <w:lastRenderedPageBreak/>
@@ -352,11 +334,43 @@
     </w:tbl>
     <w:p/>
     <w:p>
-      <w:pPr>
-        <w:rPr>
-          <w:rFonts w:hint="cs"/>
-        </w:rPr>
-      </w:pPr>
+      <w:r>
+        <w:drawing>
+          <wp:inline distT="0" distB="0" distL="0" distR="0" wp14:anchorId="5AB504E1" wp14:editId="25A59E05">
+            <wp:extent cx="5731510" cy="1115060"/>
+            <wp:effectExtent l="0" t="0" r="2540" b="8890"/>
+            <wp:docPr id="805152605" name="Picture 1"/>
+            <wp:cNvGraphicFramePr>
+              <a:graphicFrameLocks xmlns:a="http://schemas.openxmlformats.org/drawingml/2006/main" noChangeAspect="1"/>
+            </wp:cNvGraphicFramePr>
+            <a:graphic xmlns:a="http://schemas.openxmlformats.org/drawingml/2006/main">
+              <a:graphicData uri="http://schemas.openxmlformats.org/drawingml/2006/picture">
+                <pic:pic xmlns:pic="http://schemas.openxmlformats.org/drawingml/2006/picture">
+                  <pic:nvPicPr>
+                    <pic:cNvPr id="805152605" name=""/>
+                    <pic:cNvPicPr/>
+                  </pic:nvPicPr>
+                  <pic:blipFill>
+                    <a:blip r:embed="rId9"/>
+                    <a:stretch>
+                      <a:fillRect/>
+                    </a:stretch>
+                  </pic:blipFill>
+                  <pic:spPr>
+                    <a:xfrm>
+                      <a:off x="0" y="0"/>
+                      <a:ext cx="5731510" cy="1115060"/>
+                    </a:xfrm>
+                    <a:prstGeom prst="rect">
+                      <a:avLst/>
+                    </a:prstGeom>
+                  </pic:spPr>
+                </pic:pic>
+              </a:graphicData>
+            </a:graphic>
+          </wp:inline>
+        </w:drawing>
+      </w:r>
     </w:p>
     <w:sectPr>
       <w:pgSz w:w="11906" w:h="16838"/>

</xml_diff>